<commit_message>
Add day one concepts test
</commit_message>
<xml_diff>
--- a/اكواد دورة الذكاء.docx
+++ b/اكواد دورة الذكاء.docx
@@ -173,6 +173,120 @@
                 <w:sz w:val="22"/>
               </w:rPr>
               <w:t>ملاحظات الاستخدام</w:t>
+            </w:r>
+          </w:p>
+        </w:tc>
+      </w:tr>
+      <w:tr>
+        <w:tc>
+          <w:tcPr>
+            <w:tcW w:type="dxa" w:w="2700"/>
+            <w:tcMar>
+              <w:top w:w="80" w:type="dxa"/>
+              <w:start w:w="120" w:type="dxa"/>
+              <w:bottom w:w="80" w:type="dxa"/>
+              <w:end w:w="120" w:type="dxa"/>
+            </w:tcMar>
+            <w:vAlign w:val="center"/>
+          </w:tcPr>
+          <w:p>
+            <w:pPr>
+              <w:bidi/>
+              <w:jc w:val="right"/>
+            </w:pPr>
+            <w:r/>
+            <w:r>
+              <w:rPr>
+                <w:rFonts w:ascii="Calibri" w:hAnsi="Calibri" w:cs="Arial"/>
+                <w:b w:val="0"/>
+                <w:color w:val="17211F"/>
+                <w:sz w:val="22"/>
+              </w:rPr>
+              <w:t>اختبار اليوم الأول - المفاهيم الأساسية</w:t>
+            </w:r>
+          </w:p>
+        </w:tc>
+        <w:tc>
+          <w:tcPr>
+            <w:tcW w:type="dxa" w:w="1500"/>
+            <w:tcMar>
+              <w:top w:w="80" w:type="dxa"/>
+              <w:start w:w="120" w:type="dxa"/>
+              <w:bottom w:w="80" w:type="dxa"/>
+              <w:end w:w="120" w:type="dxa"/>
+            </w:tcMar>
+            <w:vAlign w:val="center"/>
+          </w:tcPr>
+          <w:p>
+            <w:pPr>
+              <w:bidi/>
+              <w:jc w:val="right"/>
+            </w:pPr>
+            <w:r/>
+            <w:r>
+              <w:rPr>
+                <w:rFonts w:ascii="Calibri" w:hAnsi="Calibri" w:cs="Arial"/>
+                <w:b w:val="0"/>
+                <w:color w:val="17211F"/>
+                <w:sz w:val="22"/>
+              </w:rPr>
+              <w:t>اختبار</w:t>
+            </w:r>
+          </w:p>
+        </w:tc>
+        <w:tc>
+          <w:tcPr>
+            <w:tcW w:type="dxa" w:w="1500"/>
+            <w:tcMar>
+              <w:top w:w="80" w:type="dxa"/>
+              <w:start w:w="120" w:type="dxa"/>
+              <w:bottom w:w="80" w:type="dxa"/>
+              <w:end w:w="120" w:type="dxa"/>
+            </w:tcMar>
+            <w:vAlign w:val="center"/>
+          </w:tcPr>
+          <w:p>
+            <w:pPr>
+              <w:bidi/>
+              <w:jc w:val="right"/>
+            </w:pPr>
+            <w:r/>
+            <w:r>
+              <w:rPr>
+                <w:rFonts w:ascii="Calibri" w:hAnsi="Calibri" w:cs="Arial"/>
+                <w:b w:val="0"/>
+                <w:color w:val="17211F"/>
+                <w:sz w:val="22"/>
+              </w:rPr>
+              <w:t>631041</w:t>
+            </w:r>
+          </w:p>
+        </w:tc>
+        <w:tc>
+          <w:tcPr>
+            <w:tcW w:type="dxa" w:w="3660"/>
+            <w:tcMar>
+              <w:top w:w="80" w:type="dxa"/>
+              <w:start w:w="120" w:type="dxa"/>
+              <w:bottom w:w="80" w:type="dxa"/>
+              <w:end w:w="120" w:type="dxa"/>
+            </w:tcMar>
+            <w:vAlign w:val="center"/>
+          </w:tcPr>
+          <w:p>
+            <w:pPr>
+              <w:bidi/>
+              <w:jc w:val="right"/>
+            </w:pPr>
+            <w:r/>
+            <w:r>
+              <w:rPr>
+                <w:rFonts w:ascii="Calibri" w:hAnsi="Calibri" w:cs="Arial"/>
+                <w:b w:val="0"/>
+                <w:color w:val="17211F"/>
+                <w:sz w:val="22"/>
+              </w:rPr>
+              <w:t>يفتح رابط اختبار Kahoot الخاص بمفاهيم اليوم الأول.</w:t>
             </w:r>
           </w:p>
         </w:tc>

</xml_diff>

<commit_message>
Add AI prompt writing exercise
</commit_message>
<xml_diff>
--- a/اكواد دورة الذكاء.docx
+++ b/اكواد دورة الذكاء.docx
@@ -633,6 +633,80 @@
           </w:p>
         </w:tc>
       </w:tr>
+      <w:tr>
+        <w:tc>
+          <w:tcPr>
+            <w:tcW w:type="dxa" w:w="2700"/>
+            <w:vAlign w:val="center"/>
+          </w:tcPr>
+          <w:p>
+            <w:pPr>
+              <w:jc w:val="right"/>
+            </w:pPr>
+            <w:r>
+              <w:rPr>
+                <w:rFonts w:ascii="Arial" w:hAnsi="Arial"/>
+                <w:sz w:val="22"/>
+              </w:rPr>
+              <w:t>تمرين صياغة أمر</w:t>
+            </w:r>
+          </w:p>
+        </w:tc>
+        <w:tc>
+          <w:tcPr>
+            <w:tcW w:type="dxa" w:w="1500"/>
+            <w:vAlign w:val="center"/>
+          </w:tcPr>
+          <w:p>
+            <w:pPr>
+              <w:jc w:val="right"/>
+            </w:pPr>
+            <w:r>
+              <w:rPr>
+                <w:rFonts w:ascii="Arial" w:hAnsi="Arial"/>
+                <w:sz w:val="22"/>
+              </w:rPr>
+              <w:t>تمرين</w:t>
+            </w:r>
+          </w:p>
+        </w:tc>
+        <w:tc>
+          <w:tcPr>
+            <w:tcW w:type="dxa" w:w="1500"/>
+            <w:vAlign w:val="center"/>
+          </w:tcPr>
+          <w:p>
+            <w:pPr>
+              <w:jc w:val="right"/>
+            </w:pPr>
+            <w:r>
+              <w:rPr>
+                <w:rFonts w:ascii="Arial" w:hAnsi="Arial"/>
+                <w:sz w:val="22"/>
+              </w:rPr>
+              <w:t>845219</w:t>
+            </w:r>
+          </w:p>
+        </w:tc>
+        <w:tc>
+          <w:tcPr>
+            <w:tcW w:type="dxa" w:w="3660"/>
+            <w:vAlign w:val="center"/>
+          </w:tcPr>
+          <w:p>
+            <w:pPr>
+              <w:jc w:val="right"/>
+            </w:pPr>
+            <w:r>
+              <w:rPr>
+                <w:rFonts w:ascii="Arial" w:hAnsi="Arial"/>
+                <w:sz w:val="22"/>
+              </w:rPr>
+              <w:t>يفتح تمرين صياغة الأمر وتقييمه بالذكاء الاصطناعي.</w:t>
+            </w:r>
+          </w:p>
+        </w:tc>
+      </w:tr>
     </w:tbl>
     <w:p>
       <w:pPr>

</xml_diff>

<commit_message>
Add thinking partner crisis exercise
</commit_message>
<xml_diff>
--- a/اكواد دورة الذكاء.docx
+++ b/اكواد دورة الذكاء.docx
@@ -707,6 +707,80 @@
           </w:p>
         </w:tc>
       </w:tr>
+      <w:tr>
+        <w:tc>
+          <w:tcPr>
+            <w:tcW w:type="dxa" w:w="2700"/>
+            <w:vAlign w:val="center"/>
+          </w:tcPr>
+          <w:p>
+            <w:pPr>
+              <w:jc w:val="right"/>
+            </w:pPr>
+            <w:r>
+              <w:rPr>
+                <w:rFonts w:ascii="Arial" w:hAnsi="Arial"/>
+                <w:sz w:val="22"/>
+              </w:rPr>
+              <w:t>تمرين شريك التفكير - أزمة منصة مهيمنة</w:t>
+            </w:r>
+          </w:p>
+        </w:tc>
+        <w:tc>
+          <w:tcPr>
+            <w:tcW w:type="dxa" w:w="1500"/>
+            <w:vAlign w:val="center"/>
+          </w:tcPr>
+          <w:p>
+            <w:pPr>
+              <w:jc w:val="right"/>
+            </w:pPr>
+            <w:r>
+              <w:rPr>
+                <w:rFonts w:ascii="Arial" w:hAnsi="Arial"/>
+                <w:sz w:val="22"/>
+              </w:rPr>
+              <w:t>تمرين</w:t>
+            </w:r>
+          </w:p>
+        </w:tc>
+        <w:tc>
+          <w:tcPr>
+            <w:tcW w:type="dxa" w:w="1500"/>
+            <w:vAlign w:val="center"/>
+          </w:tcPr>
+          <w:p>
+            <w:pPr>
+              <w:jc w:val="right"/>
+            </w:pPr>
+            <w:r>
+              <w:rPr>
+                <w:rFonts w:ascii="Arial" w:hAnsi="Arial"/>
+                <w:sz w:val="22"/>
+              </w:rPr>
+              <w:t>864531</w:t>
+            </w:r>
+          </w:p>
+        </w:tc>
+        <w:tc>
+          <w:tcPr>
+            <w:tcW w:type="dxa" w:w="3660"/>
+            <w:vAlign w:val="center"/>
+          </w:tcPr>
+          <w:p>
+            <w:pPr>
+              <w:jc w:val="right"/>
+            </w:pPr>
+            <w:r>
+              <w:rPr>
+                <w:rFonts w:ascii="Arial" w:hAnsi="Arial"/>
+                <w:sz w:val="22"/>
+              </w:rPr>
+              <w:t>يفتح تمرين شريك التفكير الخاص بأزمة منصة مهيمنة ويحفظ إجابة المشارك في الموقع.</w:t>
+            </w:r>
+          </w:p>
+        </w:tc>
+      </w:tr>
     </w:tbl>
     <w:p>
       <w:pPr>

</xml_diff>

<commit_message>
Add prompt comparison exercise
</commit_message>
<xml_diff>
--- a/اكواد دورة الذكاء.docx
+++ b/اكواد دورة الذكاء.docx
@@ -73,18 +73,7 @@
             <w:shd w:fill="F2F4F7"/>
           </w:tcPr>
           <w:p>
-            <w:pPr>
-              <w:bidi/>
-              <w:jc w:val="right"/>
-            </w:pPr>
-            <w:r/>
             <w:r>
-              <w:rPr>
-                <w:rFonts w:ascii="Calibri" w:hAnsi="Calibri" w:cs="Arial"/>
-                <w:b/>
-                <w:color w:val="0B2545"/>
-                <w:sz w:val="22"/>
-              </w:rPr>
               <w:t>النشاط</w:t>
             </w:r>
           </w:p>
@@ -102,18 +91,7 @@
             <w:shd w:fill="F2F4F7"/>
           </w:tcPr>
           <w:p>
-            <w:pPr>
-              <w:bidi/>
-              <w:jc w:val="right"/>
-            </w:pPr>
-            <w:r/>
             <w:r>
-              <w:rPr>
-                <w:rFonts w:ascii="Calibri" w:hAnsi="Calibri" w:cs="Arial"/>
-                <w:b/>
-                <w:color w:val="0B2545"/>
-                <w:sz w:val="22"/>
-              </w:rPr>
               <w:t>النوع</w:t>
             </w:r>
           </w:p>
@@ -131,18 +109,7 @@
             <w:shd w:fill="F2F4F7"/>
           </w:tcPr>
           <w:p>
-            <w:pPr>
-              <w:bidi/>
-              <w:jc w:val="right"/>
-            </w:pPr>
-            <w:r/>
             <w:r>
-              <w:rPr>
-                <w:rFonts w:ascii="Calibri" w:hAnsi="Calibri" w:cs="Arial"/>
-                <w:b/>
-                <w:color w:val="0B2545"/>
-                <w:sz w:val="22"/>
-              </w:rPr>
               <w:t>الكود</w:t>
             </w:r>
           </w:p>
@@ -160,18 +127,7 @@
             <w:shd w:fill="F2F4F7"/>
           </w:tcPr>
           <w:p>
-            <w:pPr>
-              <w:bidi/>
-              <w:jc w:val="right"/>
-            </w:pPr>
-            <w:r/>
             <w:r>
-              <w:rPr>
-                <w:rFonts w:ascii="Calibri" w:hAnsi="Calibri" w:cs="Arial"/>
-                <w:b/>
-                <w:color w:val="0B2545"/>
-                <w:sz w:val="22"/>
-              </w:rPr>
               <w:t>ملاحظات الاستخدام</w:t>
             </w:r>
           </w:p>
@@ -190,18 +146,7 @@
             <w:vAlign w:val="center"/>
           </w:tcPr>
           <w:p>
-            <w:pPr>
-              <w:bidi/>
-              <w:jc w:val="right"/>
-            </w:pPr>
-            <w:r/>
             <w:r>
-              <w:rPr>
-                <w:rFonts w:ascii="Calibri" w:hAnsi="Calibri" w:cs="Arial"/>
-                <w:b w:val="0"/>
-                <w:color w:val="17211F"/>
-                <w:sz w:val="22"/>
-              </w:rPr>
               <w:t>اختبار اليوم الأول - المفاهيم الأساسية</w:t>
             </w:r>
           </w:p>
@@ -218,18 +163,7 @@
             <w:vAlign w:val="center"/>
           </w:tcPr>
           <w:p>
-            <w:pPr>
-              <w:bidi/>
-              <w:jc w:val="right"/>
-            </w:pPr>
-            <w:r/>
             <w:r>
-              <w:rPr>
-                <w:rFonts w:ascii="Calibri" w:hAnsi="Calibri" w:cs="Arial"/>
-                <w:b w:val="0"/>
-                <w:color w:val="17211F"/>
-                <w:sz w:val="22"/>
-              </w:rPr>
               <w:t>اختبار</w:t>
             </w:r>
           </w:p>
@@ -246,18 +180,7 @@
             <w:vAlign w:val="center"/>
           </w:tcPr>
           <w:p>
-            <w:pPr>
-              <w:bidi/>
-              <w:jc w:val="right"/>
-            </w:pPr>
-            <w:r/>
             <w:r>
-              <w:rPr>
-                <w:rFonts w:ascii="Calibri" w:hAnsi="Calibri" w:cs="Arial"/>
-                <w:b w:val="0"/>
-                <w:color w:val="17211F"/>
-                <w:sz w:val="22"/>
-              </w:rPr>
               <w:t>631041</w:t>
             </w:r>
           </w:p>
@@ -274,18 +197,7 @@
             <w:vAlign w:val="center"/>
           </w:tcPr>
           <w:p>
-            <w:pPr>
-              <w:bidi/>
-              <w:jc w:val="right"/>
-            </w:pPr>
-            <w:r/>
             <w:r>
-              <w:rPr>
-                <w:rFonts w:ascii="Calibri" w:hAnsi="Calibri" w:cs="Arial"/>
-                <w:b w:val="0"/>
-                <w:color w:val="17211F"/>
-                <w:sz w:val="22"/>
-              </w:rPr>
               <w:t>يفتح رابط اختبار Kahoot الخاص بمفاهيم اليوم الأول.</w:t>
             </w:r>
           </w:p>
@@ -304,19 +216,8 @@
             <w:vAlign w:val="center"/>
           </w:tcPr>
           <w:p>
-            <w:pPr>
-              <w:bidi/>
-              <w:jc w:val="right"/>
-            </w:pPr>
-            <w:r/>
             <w:r>
-              <w:rPr>
-                <w:rFonts w:ascii="Calibri" w:hAnsi="Calibri" w:cs="Arial"/>
-                <w:b w:val="0"/>
-                <w:color w:val="17211F"/>
-                <w:sz w:val="22"/>
-              </w:rPr>
-              <w:t>تعارف المشاركين</w:t>
+              <w:t>تمرين صياغة أمر</w:t>
             </w:r>
           </w:p>
         </w:tc>
@@ -332,18 +233,7 @@
             <w:vAlign w:val="center"/>
           </w:tcPr>
           <w:p>
-            <w:pPr>
-              <w:bidi/>
-              <w:jc w:val="right"/>
-            </w:pPr>
-            <w:r/>
             <w:r>
-              <w:rPr>
-                <w:rFonts w:ascii="Calibri" w:hAnsi="Calibri" w:cs="Arial"/>
-                <w:b w:val="0"/>
-                <w:color w:val="17211F"/>
-                <w:sz w:val="22"/>
-              </w:rPr>
               <w:t>تمرين</w:t>
             </w:r>
           </w:p>
@@ -360,19 +250,8 @@
             <w:vAlign w:val="center"/>
           </w:tcPr>
           <w:p>
-            <w:pPr>
-              <w:bidi/>
-              <w:jc w:val="right"/>
-            </w:pPr>
-            <w:r/>
             <w:r>
-              <w:rPr>
-                <w:rFonts w:ascii="Calibri" w:hAnsi="Calibri" w:cs="Arial"/>
-                <w:b w:val="0"/>
-                <w:color w:val="17211F"/>
-                <w:sz w:val="22"/>
-              </w:rPr>
-              <w:t>482913</w:t>
+              <w:t>845219</w:t>
             </w:r>
           </w:p>
         </w:tc>
@@ -388,19 +267,8 @@
             <w:vAlign w:val="center"/>
           </w:tcPr>
           <w:p>
-            <w:pPr>
-              <w:bidi/>
-              <w:jc w:val="right"/>
-            </w:pPr>
-            <w:r/>
             <w:r>
-              <w:rPr>
-                <w:rFonts w:ascii="Calibri" w:hAnsi="Calibri" w:cs="Arial"/>
-                <w:b w:val="0"/>
-                <w:color w:val="17211F"/>
-                <w:sz w:val="22"/>
-              </w:rPr>
-              <w:t>يفتح صفحة التعارف ونموذج المشاركين ولوحة البطاقات.</w:t>
+              <w:t>يفتح تمرين صياغة الأمر وتقييمه بالذكاء الاصطناعي.</w:t>
             </w:r>
           </w:p>
         </w:tc>
@@ -418,19 +286,8 @@
             <w:vAlign w:val="center"/>
           </w:tcPr>
           <w:p>
-            <w:pPr>
-              <w:bidi/>
-              <w:jc w:val="right"/>
-            </w:pPr>
-            <w:r/>
             <w:r>
-              <w:rPr>
-                <w:rFonts w:ascii="Calibri" w:hAnsi="Calibri" w:cs="Arial"/>
-                <w:b w:val="0"/>
-                <w:color w:val="17211F"/>
-                <w:sz w:val="22"/>
-              </w:rPr>
-              <w:t>ما نمط قيادتك للذكاء الاصطناعي؟</w:t>
+              <w:t>تمرين مقارنة أمر بصيغتين</w:t>
             </w:r>
           </w:p>
         </w:tc>
@@ -446,19 +303,8 @@
             <w:vAlign w:val="center"/>
           </w:tcPr>
           <w:p>
-            <w:pPr>
-              <w:bidi/>
-              <w:jc w:val="right"/>
-            </w:pPr>
-            <w:r/>
             <w:r>
-              <w:rPr>
-                <w:rFonts w:ascii="Calibri" w:hAnsi="Calibri" w:cs="Arial"/>
-                <w:b w:val="0"/>
-                <w:color w:val="17211F"/>
-                <w:sz w:val="22"/>
-              </w:rPr>
-              <w:t>مقياس</w:t>
+              <w:t>تمرين</w:t>
             </w:r>
           </w:p>
         </w:tc>
@@ -474,19 +320,8 @@
             <w:vAlign w:val="center"/>
           </w:tcPr>
           <w:p>
-            <w:pPr>
-              <w:bidi/>
-              <w:jc w:val="right"/>
-            </w:pPr>
-            <w:r/>
             <w:r>
-              <w:rPr>
-                <w:rFonts w:ascii="Calibri" w:hAnsi="Calibri" w:cs="Arial"/>
-                <w:b w:val="0"/>
-                <w:color w:val="17211F"/>
-                <w:sz w:val="22"/>
-              </w:rPr>
-              <w:t>739204</w:t>
+              <w:t>528614</w:t>
             </w:r>
           </w:p>
         </w:tc>
@@ -502,19 +337,8 @@
             <w:vAlign w:val="center"/>
           </w:tcPr>
           <w:p>
-            <w:pPr>
-              <w:bidi/>
-              <w:jc w:val="right"/>
-            </w:pPr>
-            <w:r/>
             <w:r>
-              <w:rPr>
-                <w:rFonts w:ascii="Calibri" w:hAnsi="Calibri" w:cs="Arial"/>
-                <w:b w:val="0"/>
-                <w:color w:val="17211F"/>
-                <w:sz w:val="22"/>
-              </w:rPr>
-              <w:t>يفتح مقياس نمط قيادة الذكاء الاصطناعي.</w:t>
+              <w:t>يفتح تمرين مقارنة صياغتين للأمر مع إمكانية نسخ كل صيغة مباشرة للتجربة.</w:t>
             </w:r>
           </w:p>
         </w:tc>
@@ -532,19 +356,8 @@
             <w:vAlign w:val="center"/>
           </w:tcPr>
           <w:p>
-            <w:pPr>
-              <w:bidi/>
-              <w:jc w:val="right"/>
-            </w:pPr>
-            <w:r/>
             <w:r>
-              <w:rPr>
-                <w:rFonts w:ascii="Calibri" w:hAnsi="Calibri" w:cs="Arial"/>
-                <w:b w:val="0"/>
-                <w:color w:val="17211F"/>
-                <w:sz w:val="22"/>
-              </w:rPr>
-              <w:t>لوحة التحكم</w:t>
+              <w:t>تمرين شريك التفكير - أزمة منصة مهيمنة</w:t>
             </w:r>
           </w:p>
         </w:tc>
@@ -560,19 +373,8 @@
             <w:vAlign w:val="center"/>
           </w:tcPr>
           <w:p>
-            <w:pPr>
-              <w:bidi/>
-              <w:jc w:val="right"/>
-            </w:pPr>
-            <w:r/>
             <w:r>
-              <w:rPr>
-                <w:rFonts w:ascii="Calibri" w:hAnsi="Calibri" w:cs="Arial"/>
-                <w:b w:val="0"/>
-                <w:color w:val="17211F"/>
-                <w:sz w:val="22"/>
-              </w:rPr>
-              <w:t>إدارة</w:t>
+              <w:t>تمرين</w:t>
             </w:r>
           </w:p>
         </w:tc>
@@ -588,19 +390,8 @@
             <w:vAlign w:val="center"/>
           </w:tcPr>
           <w:p>
-            <w:pPr>
-              <w:bidi/>
-              <w:jc w:val="right"/>
-            </w:pPr>
-            <w:r/>
             <w:r>
-              <w:rPr>
-                <w:rFonts w:ascii="Calibri" w:hAnsi="Calibri" w:cs="Arial"/>
-                <w:b w:val="0"/>
-                <w:color w:val="17211F"/>
-                <w:sz w:val="22"/>
-              </w:rPr>
-              <w:t>710208</w:t>
+              <w:t>864531</w:t>
             </w:r>
           </w:p>
         </w:tc>
@@ -616,19 +407,92 @@
             <w:vAlign w:val="center"/>
           </w:tcPr>
           <w:p>
-            <w:pPr>
-              <w:bidi/>
-              <w:jc w:val="right"/>
-            </w:pPr>
-            <w:r/>
             <w:r>
-              <w:rPr>
-                <w:rFonts w:ascii="Calibri" w:hAnsi="Calibri" w:cs="Arial"/>
-                <w:b w:val="0"/>
-                <w:color w:val="17211F"/>
-                <w:sz w:val="22"/>
-              </w:rPr>
-              <w:t>خاص بالمدرب فقط لعرض البيانات والتصدير.</w:t>
+              <w:t>يفتح تمرين شريك التفكير الخاص بأزمة منصة مهيمنة ويحفظ إجابة المشارك في الموقع.</w:t>
+            </w:r>
+          </w:p>
+        </w:tc>
+      </w:tr>
+      <w:tr>
+        <w:tc>
+          <w:tcPr>
+            <w:tcW w:type="dxa" w:w="2700"/>
+          </w:tcPr>
+          <w:p>
+            <w:r>
+              <w:t>تعارف المشاركين</w:t>
+            </w:r>
+          </w:p>
+        </w:tc>
+        <w:tc>
+          <w:tcPr>
+            <w:tcW w:type="dxa" w:w="1500"/>
+          </w:tcPr>
+          <w:p>
+            <w:r>
+              <w:t>تمرين</w:t>
+            </w:r>
+          </w:p>
+        </w:tc>
+        <w:tc>
+          <w:tcPr>
+            <w:tcW w:type="dxa" w:w="1500"/>
+          </w:tcPr>
+          <w:p>
+            <w:r>
+              <w:t>482913</w:t>
+            </w:r>
+          </w:p>
+        </w:tc>
+        <w:tc>
+          <w:tcPr>
+            <w:tcW w:type="dxa" w:w="3660"/>
+          </w:tcPr>
+          <w:p>
+            <w:r>
+              <w:t>يفتح صفحة التعارف ونموذج المشاركين ولوحة البطاقات.</w:t>
+            </w:r>
+          </w:p>
+        </w:tc>
+      </w:tr>
+      <w:tr>
+        <w:tc>
+          <w:tcPr>
+            <w:tcW w:type="dxa" w:w="2700"/>
+          </w:tcPr>
+          <w:p>
+            <w:r>
+              <w:t>ما نمط قيادتك للذكاء الاصطناعي؟</w:t>
+            </w:r>
+          </w:p>
+        </w:tc>
+        <w:tc>
+          <w:tcPr>
+            <w:tcW w:type="dxa" w:w="1500"/>
+          </w:tcPr>
+          <w:p>
+            <w:r>
+              <w:t>مقياس</w:t>
+            </w:r>
+          </w:p>
+        </w:tc>
+        <w:tc>
+          <w:tcPr>
+            <w:tcW w:type="dxa" w:w="1500"/>
+          </w:tcPr>
+          <w:p>
+            <w:r>
+              <w:t>739204</w:t>
+            </w:r>
+          </w:p>
+        </w:tc>
+        <w:tc>
+          <w:tcPr>
+            <w:tcW w:type="dxa" w:w="3660"/>
+          </w:tcPr>
+          <w:p>
+            <w:r>
+              <w:t>يفتح مقياس نمط قيادة الذكاء الاصطناعي.</w:t>
             </w:r>
           </w:p>
         </w:tc>
@@ -640,15 +504,8 @@
             <w:vAlign w:val="center"/>
           </w:tcPr>
           <w:p>
-            <w:pPr>
-              <w:jc w:val="right"/>
-            </w:pPr>
             <w:r>
-              <w:rPr>
-                <w:rFonts w:ascii="Arial" w:hAnsi="Arial"/>
-                <w:sz w:val="22"/>
-              </w:rPr>
-              <w:t>تمرين صياغة أمر</w:t>
+              <w:t>لوحة التحكم</w:t>
             </w:r>
           </w:p>
         </w:tc>
@@ -658,15 +515,8 @@
             <w:vAlign w:val="center"/>
           </w:tcPr>
           <w:p>
-            <w:pPr>
-              <w:jc w:val="right"/>
-            </w:pPr>
             <w:r>
-              <w:rPr>
-                <w:rFonts w:ascii="Arial" w:hAnsi="Arial"/>
-                <w:sz w:val="22"/>
-              </w:rPr>
-              <w:t>تمرين</w:t>
+              <w:t>إدارة</w:t>
             </w:r>
           </w:p>
         </w:tc>
@@ -676,15 +526,8 @@
             <w:vAlign w:val="center"/>
           </w:tcPr>
           <w:p>
-            <w:pPr>
-              <w:jc w:val="right"/>
-            </w:pPr>
             <w:r>
-              <w:rPr>
-                <w:rFonts w:ascii="Arial" w:hAnsi="Arial"/>
-                <w:sz w:val="22"/>
-              </w:rPr>
-              <w:t>845219</w:t>
+              <w:t>710208</w:t>
             </w:r>
           </w:p>
         </w:tc>
@@ -694,89 +537,8 @@
             <w:vAlign w:val="center"/>
           </w:tcPr>
           <w:p>
-            <w:pPr>
-              <w:jc w:val="right"/>
-            </w:pPr>
             <w:r>
-              <w:rPr>
-                <w:rFonts w:ascii="Arial" w:hAnsi="Arial"/>
-                <w:sz w:val="22"/>
-              </w:rPr>
-              <w:t>يفتح تمرين صياغة الأمر وتقييمه بالذكاء الاصطناعي.</w:t>
-            </w:r>
-          </w:p>
-        </w:tc>
-      </w:tr>
-      <w:tr>
-        <w:tc>
-          <w:tcPr>
-            <w:tcW w:type="dxa" w:w="2700"/>
-            <w:vAlign w:val="center"/>
-          </w:tcPr>
-          <w:p>
-            <w:pPr>
-              <w:jc w:val="right"/>
-            </w:pPr>
-            <w:r>
-              <w:rPr>
-                <w:rFonts w:ascii="Arial" w:hAnsi="Arial"/>
-                <w:sz w:val="22"/>
-              </w:rPr>
-              <w:t>تمرين شريك التفكير - أزمة منصة مهيمنة</w:t>
-            </w:r>
-          </w:p>
-        </w:tc>
-        <w:tc>
-          <w:tcPr>
-            <w:tcW w:type="dxa" w:w="1500"/>
-            <w:vAlign w:val="center"/>
-          </w:tcPr>
-          <w:p>
-            <w:pPr>
-              <w:jc w:val="right"/>
-            </w:pPr>
-            <w:r>
-              <w:rPr>
-                <w:rFonts w:ascii="Arial" w:hAnsi="Arial"/>
-                <w:sz w:val="22"/>
-              </w:rPr>
-              <w:t>تمرين</w:t>
-            </w:r>
-          </w:p>
-        </w:tc>
-        <w:tc>
-          <w:tcPr>
-            <w:tcW w:type="dxa" w:w="1500"/>
-            <w:vAlign w:val="center"/>
-          </w:tcPr>
-          <w:p>
-            <w:pPr>
-              <w:jc w:val="right"/>
-            </w:pPr>
-            <w:r>
-              <w:rPr>
-                <w:rFonts w:ascii="Arial" w:hAnsi="Arial"/>
-                <w:sz w:val="22"/>
-              </w:rPr>
-              <w:t>864531</w:t>
-            </w:r>
-          </w:p>
-        </w:tc>
-        <w:tc>
-          <w:tcPr>
-            <w:tcW w:type="dxa" w:w="3660"/>
-            <w:vAlign w:val="center"/>
-          </w:tcPr>
-          <w:p>
-            <w:pPr>
-              <w:jc w:val="right"/>
-            </w:pPr>
-            <w:r>
-              <w:rPr>
-                <w:rFonts w:ascii="Arial" w:hAnsi="Arial"/>
-                <w:sz w:val="22"/>
-              </w:rPr>
-              <w:t>يفتح تمرين شريك التفكير الخاص بأزمة منصة مهيمنة ويحفظ إجابة المشارك في الموقع.</w:t>
+              <w:t>خاص بالمدرب فقط لعرض البيانات والتصدير.</w:t>
             </w:r>
           </w:p>
         </w:tc>
@@ -814,12 +576,7 @@
         <w:jc w:val="right"/>
       </w:pPr>
       <w:r>
-        <w:rPr>
-          <w:rFonts w:ascii="Calibri" w:hAnsi="Calibri" w:cs="Arial"/>
-          <w:color w:val="555555"/>
-          <w:sz w:val="20"/>
-        </w:rPr>
-        <w:t>آخر تحديث: 12 يونيو 2026</w:t>
+        <w:t>آخر تحديث: 13 يونيو 2026</w:t>
       </w:r>
     </w:p>
     <w:sectPr>

</xml_diff>

<commit_message>
Add prompt anatomy exercise
</commit_message>
<xml_diff>
--- a/اكواد دورة الذكاء.docx
+++ b/اكواد دورة الذكاء.docx
@@ -217,6 +217,76 @@
           </w:tcPr>
           <w:p>
             <w:r>
+              <w:t>تمرين تشريح الأمر الهندسي</w:t>
+            </w:r>
+          </w:p>
+        </w:tc>
+        <w:tc>
+          <w:tcPr>
+            <w:tcW w:type="dxa" w:w="1500"/>
+            <w:tcMar>
+              <w:top w:w="80" w:type="dxa"/>
+              <w:start w:w="120" w:type="dxa"/>
+              <w:bottom w:w="80" w:type="dxa"/>
+              <w:end w:w="120" w:type="dxa"/>
+            </w:tcMar>
+            <w:vAlign w:val="center"/>
+          </w:tcPr>
+          <w:p>
+            <w:r>
+              <w:t>تمرين</w:t>
+            </w:r>
+          </w:p>
+        </w:tc>
+        <w:tc>
+          <w:tcPr>
+            <w:tcW w:type="dxa" w:w="1500"/>
+            <w:tcMar>
+              <w:top w:w="80" w:type="dxa"/>
+              <w:start w:w="120" w:type="dxa"/>
+              <w:bottom w:w="80" w:type="dxa"/>
+              <w:end w:w="120" w:type="dxa"/>
+            </w:tcMar>
+            <w:vAlign w:val="center"/>
+          </w:tcPr>
+          <w:p>
+            <w:r>
+              <w:t>916472</w:t>
+            </w:r>
+          </w:p>
+        </w:tc>
+        <w:tc>
+          <w:tcPr>
+            <w:tcW w:type="dxa" w:w="3660"/>
+            <w:tcMar>
+              <w:top w:w="80" w:type="dxa"/>
+              <w:start w:w="120" w:type="dxa"/>
+              <w:bottom w:w="80" w:type="dxa"/>
+              <w:end w:w="120" w:type="dxa"/>
+            </w:tcMar>
+            <w:vAlign w:val="center"/>
+          </w:tcPr>
+          <w:p>
+            <w:r>
+              <w:t>يفتح تمرين تشريح مكونات البرومبت ويحفظ إجابة المشارك في الموقع.</w:t>
+            </w:r>
+          </w:p>
+        </w:tc>
+      </w:tr>
+      <w:tr>
+        <w:tc>
+          <w:tcPr>
+            <w:tcW w:type="dxa" w:w="2700"/>
+            <w:tcMar>
+              <w:top w:w="80" w:type="dxa"/>
+              <w:start w:w="120" w:type="dxa"/>
+              <w:bottom w:w="80" w:type="dxa"/>
+              <w:end w:w="120" w:type="dxa"/>
+            </w:tcMar>
+            <w:vAlign w:val="center"/>
+          </w:tcPr>
+          <w:p>
+            <w:r>
               <w:t>تمرين صياغة أمر</w:t>
             </w:r>
           </w:p>
@@ -347,13 +417,6 @@
         <w:tc>
           <w:tcPr>
             <w:tcW w:type="dxa" w:w="2700"/>
-            <w:tcMar>
-              <w:top w:w="80" w:type="dxa"/>
-              <w:start w:w="120" w:type="dxa"/>
-              <w:bottom w:w="80" w:type="dxa"/>
-              <w:end w:w="120" w:type="dxa"/>
-            </w:tcMar>
-            <w:vAlign w:val="center"/>
           </w:tcPr>
           <w:p>
             <w:r>
@@ -364,13 +427,6 @@
         <w:tc>
           <w:tcPr>
             <w:tcW w:type="dxa" w:w="1500"/>
-            <w:tcMar>
-              <w:top w:w="80" w:type="dxa"/>
-              <w:start w:w="120" w:type="dxa"/>
-              <w:bottom w:w="80" w:type="dxa"/>
-              <w:end w:w="120" w:type="dxa"/>
-            </w:tcMar>
-            <w:vAlign w:val="center"/>
           </w:tcPr>
           <w:p>
             <w:r>
@@ -381,13 +437,6 @@
         <w:tc>
           <w:tcPr>
             <w:tcW w:type="dxa" w:w="1500"/>
-            <w:tcMar>
-              <w:top w:w="80" w:type="dxa"/>
-              <w:start w:w="120" w:type="dxa"/>
-              <w:bottom w:w="80" w:type="dxa"/>
-              <w:end w:w="120" w:type="dxa"/>
-            </w:tcMar>
-            <w:vAlign w:val="center"/>
           </w:tcPr>
           <w:p>
             <w:r>
@@ -398,13 +447,6 @@
         <w:tc>
           <w:tcPr>
             <w:tcW w:type="dxa" w:w="3660"/>
-            <w:tcMar>
-              <w:top w:w="80" w:type="dxa"/>
-              <w:start w:w="120" w:type="dxa"/>
-              <w:bottom w:w="80" w:type="dxa"/>
-              <w:end w:w="120" w:type="dxa"/>
-            </w:tcMar>
-            <w:vAlign w:val="center"/>
           </w:tcPr>
           <w:p>
             <w:r>
@@ -459,6 +501,7 @@
         <w:tc>
           <w:tcPr>
             <w:tcW w:type="dxa" w:w="2700"/>
+            <w:vAlign w:val="center"/>
           </w:tcPr>
           <w:p>
             <w:r>
@@ -469,6 +512,7 @@
         <w:tc>
           <w:tcPr>
             <w:tcW w:type="dxa" w:w="1500"/>
+            <w:vAlign w:val="center"/>
           </w:tcPr>
           <w:p>
             <w:r>
@@ -479,6 +523,7 @@
         <w:tc>
           <w:tcPr>
             <w:tcW w:type="dxa" w:w="1500"/>
+            <w:vAlign w:val="center"/>
           </w:tcPr>
           <w:p>
             <w:r>
@@ -489,6 +534,7 @@
         <w:tc>
           <w:tcPr>
             <w:tcW w:type="dxa" w:w="3660"/>
+            <w:vAlign w:val="center"/>
           </w:tcPr>
           <w:p>
             <w:r>
@@ -501,7 +547,6 @@
         <w:tc>
           <w:tcPr>
             <w:tcW w:type="dxa" w:w="2700"/>
-            <w:vAlign w:val="center"/>
           </w:tcPr>
           <w:p>
             <w:r>
@@ -512,7 +557,6 @@
         <w:tc>
           <w:tcPr>
             <w:tcW w:type="dxa" w:w="1500"/>
-            <w:vAlign w:val="center"/>
           </w:tcPr>
           <w:p>
             <w:r>
@@ -523,7 +567,6 @@
         <w:tc>
           <w:tcPr>
             <w:tcW w:type="dxa" w:w="1500"/>
-            <w:vAlign w:val="center"/>
           </w:tcPr>
           <w:p>
             <w:r>
@@ -534,7 +577,6 @@
         <w:tc>
           <w:tcPr>
             <w:tcW w:type="dxa" w:w="3660"/>
-            <w:vAlign w:val="center"/>
           </w:tcPr>
           <w:p>
             <w:r>

</xml_diff>

<commit_message>
Add token counting exercise
</commit_message>
<xml_diff>
--- a/اكواد دورة الذكاء.docx
+++ b/اكواد دورة الذكاء.docx
@@ -347,6 +347,48 @@
         <w:tc>
           <w:tcPr>
             <w:tcW w:type="dxa" w:w="2700"/>
+          </w:tcPr>
+          <w:p>
+            <w:r>
+              <w:t>تمرين شريك التفكير - أزمة منصة مهيمنة</w:t>
+            </w:r>
+          </w:p>
+        </w:tc>
+        <w:tc>
+          <w:tcPr>
+            <w:tcW w:type="dxa" w:w="1500"/>
+          </w:tcPr>
+          <w:p>
+            <w:r>
+              <w:t>تمرين</w:t>
+            </w:r>
+          </w:p>
+        </w:tc>
+        <w:tc>
+          <w:tcPr>
+            <w:tcW w:type="dxa" w:w="1500"/>
+          </w:tcPr>
+          <w:p>
+            <w:r>
+              <w:t>864531</w:t>
+            </w:r>
+          </w:p>
+        </w:tc>
+        <w:tc>
+          <w:tcPr>
+            <w:tcW w:type="dxa" w:w="3660"/>
+          </w:tcPr>
+          <w:p>
+            <w:r>
+              <w:t>يفتح تمرين شريك التفكير الخاص بأزمة منصة مهيمنة ويحفظ إجابة المشارك في الموقع.</w:t>
+            </w:r>
+          </w:p>
+        </w:tc>
+      </w:tr>
+      <w:tr>
+        <w:tc>
+          <w:tcPr>
+            <w:tcW w:type="dxa" w:w="2700"/>
             <w:tcMar>
               <w:top w:w="80" w:type="dxa"/>
               <w:start w:w="120" w:type="dxa"/>
@@ -420,7 +462,7 @@
           </w:tcPr>
           <w:p>
             <w:r>
-              <w:t>تمرين شريك التفكير - أزمة منصة مهيمنة</w:t>
+              <w:t>تمرين حساب الرموز Tokens</w:t>
             </w:r>
           </w:p>
         </w:tc>
@@ -440,7 +482,7 @@
           </w:tcPr>
           <w:p>
             <w:r>
-              <w:t>864531</w:t>
+              <w:t>274915</w:t>
             </w:r>
           </w:p>
         </w:tc>
@@ -450,7 +492,7 @@
           </w:tcPr>
           <w:p>
             <w:r>
-              <w:t>يفتح تمرين شريك التفكير الخاص بأزمة منصة مهيمنة ويحفظ إجابة المشارك في الموقع.</w:t>
+              <w:t>يفتح تمرين حساب الرموز باستخدام OpenAI Tokenizer ويحفظ إجابة المشارك في الموقع.</w:t>
             </w:r>
           </w:p>
         </w:tc>

</xml_diff>

<commit_message>
Add AI survey builder exercise
</commit_message>
<xml_diff>
--- a/اكواد دورة الذكاء.docx
+++ b/اكواد دورة الذكاء.docx
@@ -277,6 +277,48 @@
         <w:tc>
           <w:tcPr>
             <w:tcW w:type="dxa" w:w="2700"/>
+          </w:tcPr>
+          <w:p>
+            <w:r>
+              <w:t>تمرين شريك التفكير - أزمة منصة مهيمنة</w:t>
+            </w:r>
+          </w:p>
+        </w:tc>
+        <w:tc>
+          <w:tcPr>
+            <w:tcW w:type="dxa" w:w="1500"/>
+          </w:tcPr>
+          <w:p>
+            <w:r>
+              <w:t>تمرين</w:t>
+            </w:r>
+          </w:p>
+        </w:tc>
+        <w:tc>
+          <w:tcPr>
+            <w:tcW w:type="dxa" w:w="1500"/>
+          </w:tcPr>
+          <w:p>
+            <w:r>
+              <w:t>864531</w:t>
+            </w:r>
+          </w:p>
+        </w:tc>
+        <w:tc>
+          <w:tcPr>
+            <w:tcW w:type="dxa" w:w="3660"/>
+          </w:tcPr>
+          <w:p>
+            <w:r>
+              <w:t>يفتح تمرين شريك التفكير الخاص بأزمة منصة مهيمنة ويحفظ إجابة المشارك في الموقع.</w:t>
+            </w:r>
+          </w:p>
+        </w:tc>
+      </w:tr>
+      <w:tr>
+        <w:tc>
+          <w:tcPr>
+            <w:tcW w:type="dxa" w:w="2700"/>
             <w:tcMar>
               <w:top w:w="80" w:type="dxa"/>
               <w:start w:w="120" w:type="dxa"/>
@@ -350,7 +392,7 @@
           </w:tcPr>
           <w:p>
             <w:r>
-              <w:t>تمرين شريك التفكير - أزمة منصة مهيمنة</w:t>
+              <w:t>تمرين بناء استبيان باستخدام الذكاء الاصطناعي</w:t>
             </w:r>
           </w:p>
         </w:tc>
@@ -370,7 +412,7 @@
           </w:tcPr>
           <w:p>
             <w:r>
-              <w:t>864531</w:t>
+              <w:t>359812</w:t>
             </w:r>
           </w:p>
         </w:tc>
@@ -380,7 +422,7 @@
           </w:tcPr>
           <w:p>
             <w:r>
-              <w:t>يفتح تمرين شريك التفكير الخاص بأزمة منصة مهيمنة ويحفظ إجابة المشارك في الموقع.</w:t>
+              <w:t>يفتح تمرين بناء استبيان للعملاء باستخدام الذكاء الاصطناعي ويحفظ إجابة المشارك في الموقع.</w:t>
             </w:r>
           </w:p>
         </w:tc>

</xml_diff>

<commit_message>
Add course completion survey
</commit_message>
<xml_diff>
--- a/اكواد دورة الذكاء.docx
+++ b/اكواد دورة الذكاء.docx
@@ -634,6 +634,48 @@
           </w:tcPr>
           <w:p>
             <w:r>
+              <w:t>استبيان ما بعد الدورة التدريبية</w:t>
+            </w:r>
+          </w:p>
+        </w:tc>
+        <w:tc>
+          <w:tcPr>
+            <w:tcW w:type="dxa" w:w="1500"/>
+          </w:tcPr>
+          <w:p>
+            <w:r>
+              <w:t>تمرين</w:t>
+            </w:r>
+          </w:p>
+        </w:tc>
+        <w:tc>
+          <w:tcPr>
+            <w:tcW w:type="dxa" w:w="1500"/>
+          </w:tcPr>
+          <w:p>
+            <w:r>
+              <w:t>517903</w:t>
+            </w:r>
+          </w:p>
+        </w:tc>
+        <w:tc>
+          <w:tcPr>
+            <w:tcW w:type="dxa" w:w="3660"/>
+          </w:tcPr>
+          <w:p>
+            <w:r>
+              <w:t>يفتح الاستبيان الختامي بعد الدورة ويحفظ تقييم المشارك وشهادته وموافقته في لوحة التحكم.</w:t>
+            </w:r>
+          </w:p>
+        </w:tc>
+      </w:tr>
+      <w:tr>
+        <w:tc>
+          <w:tcPr>
+            <w:tcW w:type="dxa" w:w="2700"/>
+          </w:tcPr>
+          <w:p>
+            <w:r>
               <w:t>لوحة التحكم</w:t>
             </w:r>
           </w:p>
@@ -702,7 +744,7 @@
         <w:jc w:val="right"/>
       </w:pPr>
       <w:r>
-        <w:t>آخر تحديث: 13 يونيو 2026</w:t>
+        <w:t>آخر تحديث: 14 يونيو 2026</w:t>
       </w:r>
     </w:p>
     <w:sectPr>

</xml_diff>

<commit_message>
Add professional prompt engineering exercise
</commit_message>
<xml_diff>
--- a/اكواد دورة الذكاء.docx
+++ b/اكواد دورة الذكاء.docx
@@ -269,6 +269,76 @@
           <w:p>
             <w:r>
               <w:t>يفتح تمرين تشريح مكونات البرومبت ويحفظ إجابة المشارك في الموقع.</w:t>
+            </w:r>
+          </w:p>
+        </w:tc>
+      </w:tr>
+      <w:tr>
+        <w:tc>
+          <w:tcPr>
+            <w:tcW w:type="dxa" w:w="2700"/>
+            <w:tcMar>
+              <w:top w:w="80" w:type="dxa"/>
+              <w:start w:w="120" w:type="dxa"/>
+              <w:bottom w:w="80" w:type="dxa"/>
+              <w:end w:w="120" w:type="dxa"/>
+            </w:tcMar>
+            <w:vAlign w:val="center"/>
+          </w:tcPr>
+          <w:p>
+            <w:r>
+              <w:t>هندسة الأوامر الاحترافية</w:t>
+            </w:r>
+          </w:p>
+        </w:tc>
+        <w:tc>
+          <w:tcPr>
+            <w:tcW w:type="dxa" w:w="1500"/>
+            <w:tcMar>
+              <w:top w:w="80" w:type="dxa"/>
+              <w:start w:w="120" w:type="dxa"/>
+              <w:bottom w:w="80" w:type="dxa"/>
+              <w:end w:w="120" w:type="dxa"/>
+            </w:tcMar>
+            <w:vAlign w:val="center"/>
+          </w:tcPr>
+          <w:p>
+            <w:r>
+              <w:t>تمرين</w:t>
+            </w:r>
+          </w:p>
+        </w:tc>
+        <w:tc>
+          <w:tcPr>
+            <w:tcW w:type="dxa" w:w="1500"/>
+            <w:tcMar>
+              <w:top w:w="80" w:type="dxa"/>
+              <w:start w:w="120" w:type="dxa"/>
+              <w:bottom w:w="80" w:type="dxa"/>
+              <w:end w:w="120" w:type="dxa"/>
+            </w:tcMar>
+            <w:vAlign w:val="center"/>
+          </w:tcPr>
+          <w:p>
+            <w:r>
+              <w:t>638527</w:t>
+            </w:r>
+          </w:p>
+        </w:tc>
+        <w:tc>
+          <w:tcPr>
+            <w:tcW w:type="dxa" w:w="3660"/>
+            <w:tcMar>
+              <w:top w:w="80" w:type="dxa"/>
+              <w:start w:w="120" w:type="dxa"/>
+              <w:bottom w:w="80" w:type="dxa"/>
+              <w:end w:w="120" w:type="dxa"/>
+            </w:tcMar>
+            <w:vAlign w:val="center"/>
+          </w:tcPr>
+          <w:p>
+            <w:r>
+              <w:t>يفتح تمرين إنشاء مشروع هندسة أوامر احترافية مع أمر موسع وآخر مبسط قابلين للنسخ مباشرة.</w:t>
             </w:r>
           </w:p>
         </w:tc>
@@ -744,7 +814,7 @@
         <w:jc w:val="right"/>
       </w:pPr>
       <w:r>
-        <w:t>آخر تحديث: 14 يونيو 2026</w:t>
+        <w:t>آخر تحديث: 15 يونيو 2026</w:t>
       </w:r>
     </w:p>
     <w:sectPr>

</xml_diff>

<commit_message>
Add SWOT project exercise
</commit_message>
<xml_diff>
--- a/اكواد دورة الذكاء.docx
+++ b/اكواد دورة الذكاء.docx
@@ -339,6 +339,76 @@
           <w:p>
             <w:r>
               <w:t>يفتح تمرين إنشاء مشروع هندسة أوامر احترافية مع أمر موسع وآخر مبسط قابلين للنسخ مباشرة.</w:t>
+            </w:r>
+          </w:p>
+        </w:tc>
+      </w:tr>
+      <w:tr>
+        <w:tc>
+          <w:tcPr>
+            <w:tcW w:type="dxa" w:w="2700"/>
+            <w:tcMar>
+              <w:top w:w="80" w:type="dxa"/>
+              <w:start w:w="120" w:type="dxa"/>
+              <w:bottom w:w="80" w:type="dxa"/>
+              <w:end w:w="120" w:type="dxa"/>
+            </w:tcMar>
+            <w:vAlign w:val="center"/>
+          </w:tcPr>
+          <w:p>
+            <w:r>
+              <w:t>إنشاء مشروع تحليل SWOT</w:t>
+            </w:r>
+          </w:p>
+        </w:tc>
+        <w:tc>
+          <w:tcPr>
+            <w:tcW w:type="dxa" w:w="1500"/>
+            <w:tcMar>
+              <w:top w:w="80" w:type="dxa"/>
+              <w:start w:w="120" w:type="dxa"/>
+              <w:bottom w:w="80" w:type="dxa"/>
+              <w:end w:w="120" w:type="dxa"/>
+            </w:tcMar>
+            <w:vAlign w:val="center"/>
+          </w:tcPr>
+          <w:p>
+            <w:r>
+              <w:t>تمرين</w:t>
+            </w:r>
+          </w:p>
+        </w:tc>
+        <w:tc>
+          <w:tcPr>
+            <w:tcW w:type="dxa" w:w="1500"/>
+            <w:tcMar>
+              <w:top w:w="80" w:type="dxa"/>
+              <w:start w:w="120" w:type="dxa"/>
+              <w:bottom w:w="80" w:type="dxa"/>
+              <w:end w:w="120" w:type="dxa"/>
+            </w:tcMar>
+            <w:vAlign w:val="center"/>
+          </w:tcPr>
+          <w:p>
+            <w:r>
+              <w:t>492681</w:t>
+            </w:r>
+          </w:p>
+        </w:tc>
+        <w:tc>
+          <w:tcPr>
+            <w:tcW w:type="dxa" w:w="3660"/>
+            <w:tcMar>
+              <w:top w:w="80" w:type="dxa"/>
+              <w:start w:w="120" w:type="dxa"/>
+              <w:bottom w:w="80" w:type="dxa"/>
+              <w:end w:w="120" w:type="dxa"/>
+            </w:tcMar>
+            <w:vAlign w:val="center"/>
+          </w:tcPr>
+          <w:p>
+            <w:r>
+              <w:t>يفتح تمرين تحميل ملف swot-core لاستخدامه في بناء مشروع تحليل SWOT للشركات.</w:t>
             </w:r>
           </w:p>
         </w:tc>

</xml_diff>